<commit_message>
Add 5-Fold CV results section (5.7) to PDF and DOCX reports with tables, images, and interpretation
Co-authored-by: emirsecer1 <158167678+emirsecer1@users.noreply.github.com>
Agent-Logs-Url: https://github.com/emirsecer1/BeeDiseasesClassification/sessions/decf24de-da79-4cd1-a899-caab35aa431a
</commit_message>
<xml_diff>
--- a/Results/BeeDiesessClassificion.docx
+++ b/Results/BeeDiesessClassificion.docx
@@ -23175,6 +23175,815 @@
         <w:t>.</w:t>
       </w:r>
     </w:p>
+    <w:p>
+      <w:pPr>
+        <w:pStyle w:val="Heading2"/>
+      </w:pPr>
+      <w:r>
+        <w:rPr>
+          <w:b/>
+          <w:sz w:val="28"/>
+          <w:szCs w:val="28"/>
+        </w:rPr>
+        <w:t xml:space="preserve">5.7 5-Katlı Çapraz Doğrulama Sonuçları</w:t>
+      </w:r>
+    </w:p>
+    <w:p>
+      <w:r>
+        <w:rPr>
+          <w:sz w:val="20"/>
+          <w:szCs w:val="20"/>
+        </w:rPr>
+        <w:t xml:space="preserve">Önceki bölümlerde sunulan bireysel model sonuçları tek bir doğrulama kümesi (Fold 0) üzerinden elde edilmiştir. Modellerin istatistiksel güvenilirliğini değerlendirmek amacıyla, EfficientNetV2-S ve Swin Transformer modelleri 5 katlı tabakalı çapraz doğrulama (5-Fold Stratified Cross-Validation) ile kapsamlı biçimde yeniden değerlendirilmiştir. Her fold için model sıfırdan eğitilmiş ve aynı hiperparametre konfigürasyonu kullanılmıştır.</w:t>
+      </w:r>
+    </w:p>
+    <w:p>
+      <w:r>
+        <w:rPr>
+          <w:b/>
+          <w:sz w:val="18"/>
+          <w:szCs w:val="18"/>
+        </w:rPr>
+        <w:t xml:space="preserve">Tablo 5: 5-Fold CV Özet Sonuçları (Ortalama ± Std)</w:t>
+      </w:r>
+    </w:p>
+    <w:tbl>
+      <w:tblPr>
+        <w:tblW w:type="auto" w:w="0"/>
+        <w:tblLook w:firstColumn="1" w:firstRow="1" w:lastColumn="0" w:lastRow="0" w:noHBand="0" w:noVBand="1" w:val="04A0"/>
+      </w:tblPr>
+      <w:tblGrid>
+        <w:gridCol w:w="1928"/>
+        <w:gridCol w:w="1928"/>
+        <w:gridCol w:w="1928"/>
+        <w:gridCol w:w="1928"/>
+        <w:gridCol w:w="1928"/>
+      </w:tblGrid>
+      <w:tr>
+        <w:tc>
+          <w:tcPr>
+            <w:tcW w:type="dxa" w:w="1928"/>
+          </w:tcPr>
+          <w:p>
+            <w:r>
+              <w:rPr>
+                <w:b/>
+                <w:sz w:val="18"/>
+              </w:rPr>
+              <w:t>Model</w:t>
+            </w:r>
+          </w:p>
+        </w:tc>
+        <w:tc>
+          <w:tcPr>
+            <w:tcW w:type="dxa" w:w="1928"/>
+          </w:tcPr>
+          <w:p>
+            <w:r>
+              <w:rPr>
+                <w:b/>
+                <w:sz w:val="18"/>
+              </w:rPr>
+              <w:t>Accuracy (%)</w:t>
+            </w:r>
+          </w:p>
+        </w:tc>
+        <w:tc>
+          <w:tcPr>
+            <w:tcW w:type="dxa" w:w="1928"/>
+          </w:tcPr>
+          <w:p>
+            <w:r>
+              <w:rPr>
+                <w:b/>
+                <w:sz w:val="18"/>
+              </w:rPr>
+              <w:t>F1-Score (%)</w:t>
+            </w:r>
+          </w:p>
+        </w:tc>
+        <w:tc>
+          <w:tcPr>
+            <w:tcW w:type="dxa" w:w="1928"/>
+          </w:tcPr>
+          <w:p>
+            <w:r>
+              <w:rPr>
+                <w:b/>
+                <w:sz w:val="18"/>
+              </w:rPr>
+              <w:t>Precision (%)</w:t>
+            </w:r>
+          </w:p>
+        </w:tc>
+        <w:tc>
+          <w:tcPr>
+            <w:tcW w:type="dxa" w:w="1928"/>
+          </w:tcPr>
+          <w:p>
+            <w:r>
+              <w:rPr>
+                <w:b/>
+                <w:sz w:val="18"/>
+              </w:rPr>
+              <w:t>Recall (%)</w:t>
+            </w:r>
+          </w:p>
+        </w:tc>
+      </w:tr>
+      <w:tr>
+        <w:tc>
+          <w:tcPr>
+            <w:tcW w:type="dxa" w:w="1928"/>
+          </w:tcPr>
+          <w:p>
+            <w:r>
+              <w:rPr>
+                <w:sz w:val="18"/>
+              </w:rPr>
+              <w:t>EfficientNetV2-S</w:t>
+            </w:r>
+          </w:p>
+        </w:tc>
+        <w:tc>
+          <w:tcPr>
+            <w:tcW w:type="dxa" w:w="1928"/>
+          </w:tcPr>
+          <w:p>
+            <w:r>
+              <w:rPr>
+                <w:sz w:val="18"/>
+              </w:rPr>
+              <w:t>98.45 ± 0.36</w:t>
+            </w:r>
+          </w:p>
+        </w:tc>
+        <w:tc>
+          <w:tcPr>
+            <w:tcW w:type="dxa" w:w="1928"/>
+          </w:tcPr>
+          <w:p>
+            <w:r>
+              <w:rPr>
+                <w:sz w:val="18"/>
+              </w:rPr>
+              <w:t>98.45 ± 0.35</w:t>
+            </w:r>
+          </w:p>
+        </w:tc>
+        <w:tc>
+          <w:tcPr>
+            <w:tcW w:type="dxa" w:w="1928"/>
+          </w:tcPr>
+          <w:p>
+            <w:r>
+              <w:rPr>
+                <w:sz w:val="18"/>
+              </w:rPr>
+              <w:t>98.52 ± 0.31</w:t>
+            </w:r>
+          </w:p>
+        </w:tc>
+        <w:tc>
+          <w:tcPr>
+            <w:tcW w:type="dxa" w:w="1928"/>
+          </w:tcPr>
+          <w:p>
+            <w:r>
+              <w:rPr>
+                <w:sz w:val="18"/>
+              </w:rPr>
+              <w:t>98.45 ± 0.36</w:t>
+            </w:r>
+          </w:p>
+        </w:tc>
+      </w:tr>
+      <w:tr>
+        <w:tc>
+          <w:tcPr>
+            <w:tcW w:type="dxa" w:w="1928"/>
+          </w:tcPr>
+          <w:p>
+            <w:r>
+              <w:rPr>
+                <w:sz w:val="18"/>
+              </w:rPr>
+              <w:t>Swin Transformer</w:t>
+            </w:r>
+          </w:p>
+        </w:tc>
+        <w:tc>
+          <w:tcPr>
+            <w:tcW w:type="dxa" w:w="1928"/>
+          </w:tcPr>
+          <w:p>
+            <w:r>
+              <w:rPr>
+                <w:sz w:val="18"/>
+              </w:rPr>
+              <w:t>98.51 ± 0.54</w:t>
+            </w:r>
+          </w:p>
+        </w:tc>
+        <w:tc>
+          <w:tcPr>
+            <w:tcW w:type="dxa" w:w="1928"/>
+          </w:tcPr>
+          <w:p>
+            <w:r>
+              <w:rPr>
+                <w:sz w:val="18"/>
+              </w:rPr>
+              <w:t>98.51 ± 0.53</w:t>
+            </w:r>
+          </w:p>
+        </w:tc>
+        <w:tc>
+          <w:tcPr>
+            <w:tcW w:type="dxa" w:w="1928"/>
+          </w:tcPr>
+          <w:p>
+            <w:r>
+              <w:rPr>
+                <w:sz w:val="18"/>
+              </w:rPr>
+              <w:t>98.56 ± 0.47</w:t>
+            </w:r>
+          </w:p>
+        </w:tc>
+        <w:tc>
+          <w:tcPr>
+            <w:tcW w:type="dxa" w:w="1928"/>
+          </w:tcPr>
+          <w:p>
+            <w:r>
+              <w:rPr>
+                <w:sz w:val="18"/>
+              </w:rPr>
+              <w:t>98.51 ± 0.54</w:t>
+            </w:r>
+          </w:p>
+        </w:tc>
+      </w:tr>
+    </w:tbl>
+    <w:p>
+      <w:r>
+        <w:rPr>
+          <w:sz w:val="20"/>
+          <w:szCs w:val="20"/>
+        </w:rPr>
+        <w:t xml:space="preserve">Her iki model de %98'in üzerinde ortalama doğruluk elde etmiştir. Swin Transformer, %98,51 ± 0,54 doğruluk ile EfficientNetV2-S'nin %98,45 ± 0,36 sonucunu küçük bir farkla geçmiştir. Swin Transformer'ın standart sapması daha yüksek olup fold'lar arası performans varyasyonunun biraz daha fazla olduğuna işaret etmektedir.</w:t>
+      </w:r>
+    </w:p>
+    <w:p>
+      <w:r>
+        <w:rPr>
+          <w:b/>
+          <w:sz w:val="18"/>
+          <w:szCs w:val="18"/>
+        </w:rPr>
+        <w:t xml:space="preserve">Tablo 6: Swin Transformer Fold Bazlı Sonuçlar</w:t>
+      </w:r>
+    </w:p>
+    <w:tbl>
+      <w:tblPr>
+        <w:tblW w:type="auto" w:w="0"/>
+        <w:tblLook w:firstColumn="1" w:firstRow="1" w:lastColumn="0" w:lastRow="0" w:noHBand="0" w:noVBand="1" w:val="04A0"/>
+      </w:tblPr>
+      <w:tblGrid>
+        <w:gridCol w:w="1928"/>
+        <w:gridCol w:w="1928"/>
+        <w:gridCol w:w="1928"/>
+        <w:gridCol w:w="1928"/>
+        <w:gridCol w:w="1928"/>
+      </w:tblGrid>
+      <w:tr>
+        <w:tc>
+          <w:tcPr>
+            <w:tcW w:type="dxa" w:w="1928"/>
+          </w:tcPr>
+          <w:p>
+            <w:r>
+              <w:rPr>
+                <w:b/>
+                <w:sz w:val="18"/>
+              </w:rPr>
+              <w:t>Fold</w:t>
+            </w:r>
+          </w:p>
+        </w:tc>
+        <w:tc>
+          <w:tcPr>
+            <w:tcW w:type="dxa" w:w="1928"/>
+          </w:tcPr>
+          <w:p>
+            <w:r>
+              <w:rPr>
+                <w:b/>
+                <w:sz w:val="18"/>
+              </w:rPr>
+              <w:t>Accuracy (%)</w:t>
+            </w:r>
+          </w:p>
+        </w:tc>
+        <w:tc>
+          <w:tcPr>
+            <w:tcW w:type="dxa" w:w="1928"/>
+          </w:tcPr>
+          <w:p>
+            <w:r>
+              <w:rPr>
+                <w:b/>
+                <w:sz w:val="18"/>
+              </w:rPr>
+              <w:t>F1-Score (%)</w:t>
+            </w:r>
+          </w:p>
+        </w:tc>
+        <w:tc>
+          <w:tcPr>
+            <w:tcW w:type="dxa" w:w="1928"/>
+          </w:tcPr>
+          <w:p>
+            <w:r>
+              <w:rPr>
+                <w:b/>
+                <w:sz w:val="18"/>
+              </w:rPr>
+              <w:t>Precision (%)</w:t>
+            </w:r>
+          </w:p>
+        </w:tc>
+        <w:tc>
+          <w:tcPr>
+            <w:tcW w:type="dxa" w:w="1928"/>
+          </w:tcPr>
+          <w:p>
+            <w:r>
+              <w:rPr>
+                <w:b/>
+                <w:sz w:val="18"/>
+              </w:rPr>
+              <w:t>Recall (%)</w:t>
+            </w:r>
+          </w:p>
+        </w:tc>
+      </w:tr>
+      <w:tr>
+        <w:tc>
+          <w:tcPr>
+            <w:tcW w:type="dxa" w:w="1928"/>
+          </w:tcPr>
+          <w:p>
+            <w:r>
+              <w:rPr>
+                <w:sz w:val="18"/>
+              </w:rPr>
+              <w:t>Fold 0</w:t>
+            </w:r>
+          </w:p>
+        </w:tc>
+        <w:tc>
+          <w:tcPr>
+            <w:tcW w:type="dxa" w:w="1928"/>
+          </w:tcPr>
+          <w:p>
+            <w:r>
+              <w:rPr>
+                <w:sz w:val="18"/>
+              </w:rPr>
+              <w:t>98.84</w:t>
+            </w:r>
+          </w:p>
+        </w:tc>
+        <w:tc>
+          <w:tcPr>
+            <w:tcW w:type="dxa" w:w="1928"/>
+          </w:tcPr>
+          <w:p>
+            <w:r>
+              <w:rPr>
+                <w:sz w:val="18"/>
+              </w:rPr>
+              <w:t>98.84</w:t>
+            </w:r>
+          </w:p>
+        </w:tc>
+        <w:tc>
+          <w:tcPr>
+            <w:tcW w:type="dxa" w:w="1928"/>
+          </w:tcPr>
+          <w:p>
+            <w:r>
+              <w:rPr>
+                <w:sz w:val="18"/>
+              </w:rPr>
+              <w:t>98.85</w:t>
+            </w:r>
+          </w:p>
+        </w:tc>
+        <w:tc>
+          <w:tcPr>
+            <w:tcW w:type="dxa" w:w="1928"/>
+          </w:tcPr>
+          <w:p>
+            <w:r>
+              <w:rPr>
+                <w:sz w:val="18"/>
+              </w:rPr>
+              <w:t>98.84</w:t>
+            </w:r>
+          </w:p>
+        </w:tc>
+      </w:tr>
+      <w:tr>
+        <w:tc>
+          <w:tcPr>
+            <w:tcW w:type="dxa" w:w="1928"/>
+          </w:tcPr>
+          <w:p>
+            <w:r>
+              <w:rPr>
+                <w:sz w:val="18"/>
+              </w:rPr>
+              <w:t>Fold 1</w:t>
+            </w:r>
+          </w:p>
+        </w:tc>
+        <w:tc>
+          <w:tcPr>
+            <w:tcW w:type="dxa" w:w="1928"/>
+          </w:tcPr>
+          <w:p>
+            <w:r>
+              <w:rPr>
+                <w:sz w:val="18"/>
+              </w:rPr>
+              <w:t>98.26</w:t>
+            </w:r>
+          </w:p>
+        </w:tc>
+        <w:tc>
+          <w:tcPr>
+            <w:tcW w:type="dxa" w:w="1928"/>
+          </w:tcPr>
+          <w:p>
+            <w:r>
+              <w:rPr>
+                <w:sz w:val="18"/>
+              </w:rPr>
+              <w:t>98.27</w:t>
+            </w:r>
+          </w:p>
+        </w:tc>
+        <w:tc>
+          <w:tcPr>
+            <w:tcW w:type="dxa" w:w="1928"/>
+          </w:tcPr>
+          <w:p>
+            <w:r>
+              <w:rPr>
+                <w:sz w:val="18"/>
+              </w:rPr>
+              <w:t>98.35</w:t>
+            </w:r>
+          </w:p>
+        </w:tc>
+        <w:tc>
+          <w:tcPr>
+            <w:tcW w:type="dxa" w:w="1928"/>
+          </w:tcPr>
+          <w:p>
+            <w:r>
+              <w:rPr>
+                <w:sz w:val="18"/>
+              </w:rPr>
+              <w:t>98.26</w:t>
+            </w:r>
+          </w:p>
+        </w:tc>
+      </w:tr>
+      <w:tr>
+        <w:tc>
+          <w:tcPr>
+            <w:tcW w:type="dxa" w:w="1928"/>
+          </w:tcPr>
+          <w:p>
+            <w:r>
+              <w:rPr>
+                <w:sz w:val="18"/>
+              </w:rPr>
+              <w:t>Fold 2</w:t>
+            </w:r>
+          </w:p>
+        </w:tc>
+        <w:tc>
+          <w:tcPr>
+            <w:tcW w:type="dxa" w:w="1928"/>
+          </w:tcPr>
+          <w:p>
+            <w:r>
+              <w:rPr>
+                <w:sz w:val="18"/>
+              </w:rPr>
+              <w:t>97.68</w:t>
+            </w:r>
+          </w:p>
+        </w:tc>
+        <w:tc>
+          <w:tcPr>
+            <w:tcW w:type="dxa" w:w="1928"/>
+          </w:tcPr>
+          <w:p>
+            <w:r>
+              <w:rPr>
+                <w:sz w:val="18"/>
+              </w:rPr>
+              <w:t>97.68</w:t>
+            </w:r>
+          </w:p>
+        </w:tc>
+        <w:tc>
+          <w:tcPr>
+            <w:tcW w:type="dxa" w:w="1928"/>
+          </w:tcPr>
+          <w:p>
+            <w:r>
+              <w:rPr>
+                <w:sz w:val="18"/>
+              </w:rPr>
+              <w:t>97.83</w:t>
+            </w:r>
+          </w:p>
+        </w:tc>
+        <w:tc>
+          <w:tcPr>
+            <w:tcW w:type="dxa" w:w="1928"/>
+          </w:tcPr>
+          <w:p>
+            <w:r>
+              <w:rPr>
+                <w:sz w:val="18"/>
+              </w:rPr>
+              <w:t>97.68</w:t>
+            </w:r>
+          </w:p>
+        </w:tc>
+      </w:tr>
+      <w:tr>
+        <w:tc>
+          <w:tcPr>
+            <w:tcW w:type="dxa" w:w="1928"/>
+          </w:tcPr>
+          <w:p>
+            <w:r>
+              <w:rPr>
+                <w:sz w:val="18"/>
+              </w:rPr>
+              <w:t>Fold 3</w:t>
+            </w:r>
+          </w:p>
+        </w:tc>
+        <w:tc>
+          <w:tcPr>
+            <w:tcW w:type="dxa" w:w="1928"/>
+          </w:tcPr>
+          <w:p>
+            <w:r>
+              <w:rPr>
+                <w:sz w:val="18"/>
+              </w:rPr>
+              <w:t>98.84</w:t>
+            </w:r>
+          </w:p>
+        </w:tc>
+        <w:tc>
+          <w:tcPr>
+            <w:tcW w:type="dxa" w:w="1928"/>
+          </w:tcPr>
+          <w:p>
+            <w:r>
+              <w:rPr>
+                <w:sz w:val="18"/>
+              </w:rPr>
+              <w:t>98.84</w:t>
+            </w:r>
+          </w:p>
+        </w:tc>
+        <w:tc>
+          <w:tcPr>
+            <w:tcW w:type="dxa" w:w="1928"/>
+          </w:tcPr>
+          <w:p>
+            <w:r>
+              <w:rPr>
+                <w:sz w:val="18"/>
+              </w:rPr>
+              <w:t>98.85</w:t>
+            </w:r>
+          </w:p>
+        </w:tc>
+        <w:tc>
+          <w:tcPr>
+            <w:tcW w:type="dxa" w:w="1928"/>
+          </w:tcPr>
+          <w:p>
+            <w:r>
+              <w:rPr>
+                <w:sz w:val="18"/>
+              </w:rPr>
+              <w:t>98.84</w:t>
+            </w:r>
+          </w:p>
+        </w:tc>
+      </w:tr>
+      <w:tr>
+        <w:tc>
+          <w:tcPr>
+            <w:tcW w:type="dxa" w:w="1928"/>
+          </w:tcPr>
+          <w:p>
+            <w:r>
+              <w:rPr>
+                <w:sz w:val="18"/>
+              </w:rPr>
+              <w:t>Fold 4</w:t>
+            </w:r>
+          </w:p>
+        </w:tc>
+        <w:tc>
+          <w:tcPr>
+            <w:tcW w:type="dxa" w:w="1928"/>
+          </w:tcPr>
+          <w:p>
+            <w:r>
+              <w:rPr>
+                <w:sz w:val="18"/>
+              </w:rPr>
+              <w:t>98.94</w:t>
+            </w:r>
+          </w:p>
+        </w:tc>
+        <w:tc>
+          <w:tcPr>
+            <w:tcW w:type="dxa" w:w="1928"/>
+          </w:tcPr>
+          <w:p>
+            <w:r>
+              <w:rPr>
+                <w:sz w:val="18"/>
+              </w:rPr>
+              <w:t>98.93</w:t>
+            </w:r>
+          </w:p>
+        </w:tc>
+        <w:tc>
+          <w:tcPr>
+            <w:tcW w:type="dxa" w:w="1928"/>
+          </w:tcPr>
+          <w:p>
+            <w:r>
+              <w:rPr>
+                <w:sz w:val="18"/>
+              </w:rPr>
+              <w:t>98.93</w:t>
+            </w:r>
+          </w:p>
+        </w:tc>
+        <w:tc>
+          <w:tcPr>
+            <w:tcW w:type="dxa" w:w="1928"/>
+          </w:tcPr>
+          <w:p>
+            <w:r>
+              <w:rPr>
+                <w:sz w:val="18"/>
+              </w:rPr>
+              <w:t>98.94</w:t>
+            </w:r>
+          </w:p>
+        </w:tc>
+      </w:tr>
+    </w:tbl>
+    <w:p>
+      <w:r>
+        <w:rPr>
+          <w:sz w:val="20"/>
+          <w:szCs w:val="20"/>
+        </w:rPr>
+        <w:t xml:space="preserve">Tablo 6, Swin Transformer'ın 5 fold üzerindeki ayrıntılı sonuçlarını göstermektedir. En yüksek doğruluk Fold 4'te (%98,94), en düşük ise Fold 2'de (%97,68) elde edilmiştir. Tüm fold'larda F1 skoru doğruluk ile yakın değerlerde seyretmekte olup sınıf dengesizliğine rağmen modelin dengeli performans sergilediğini göstermektedir.</w:t>
+      </w:r>
+    </w:p>
+    <w:p>
+      <w:r>
+        <w:drawing>
+          <wp:inline>
+            <wp:extent cx="4114800" cy="1530968"/>
+            <wp:docPr id="2056669338" name="Picture 2056669338"/>
+            <wp:cNvGraphicFramePr>
+              <a:graphicFrameLocks noChangeAspect="1"/>
+            </wp:cNvGraphicFramePr>
+            <a:graphic>
+              <a:graphicData uri="http://schemas.openxmlformats.org/drawingml/2006/picture">
+                <pic:pic>
+                  <pic:nvPicPr>
+                    <pic:cNvPr id="0" name="kfold_cv_results.png"/>
+                    <pic:cNvPicPr/>
+                  </pic:nvPicPr>
+                  <pic:blipFill>
+                    <a:blip r:embed="rId3"/>
+                    <a:stretch>
+                      <a:fillRect/>
+                    </a:stretch>
+                  </pic:blipFill>
+                  <pic:spPr>
+                    <a:xfrm>
+                      <a:off x="0" y="0"/>
+                      <a:ext cx="4114800" cy="1530968"/>
+                    </a:xfrm>
+                    <a:prstGeom prst="rect"/>
+                  </pic:spPr>
+                </pic:pic>
+              </a:graphicData>
+            </a:graphic>
+          </wp:inline>
+        </w:drawing>
+      </w:r>
+    </w:p>
+    <w:p>
+      <w:r>
+        <w:rPr>
+          <w:i/>
+          <w:sz w:val="18"/>
+          <w:szCs w:val="18"/>
+        </w:rPr>
+        <w:t xml:space="preserve">Şekil 9: 5-Fold çapraz doğrulama sonuçları – EfficientNetV2-S ve Swin Transformer modellerinin fold bazlı doğruluk ve F1 skor karşılaştırması.</w:t>
+      </w:r>
+    </w:p>
+    <w:p>
+      <w:r>
+        <w:drawing>
+          <wp:inline>
+            <wp:extent cx="4114800" cy="1021463"/>
+            <wp:docPr id="2056669339" name="Picture 2056669339"/>
+            <wp:cNvGraphicFramePr>
+              <a:graphicFrameLocks noChangeAspect="1"/>
+            </wp:cNvGraphicFramePr>
+            <a:graphic>
+              <a:graphicData uri="http://schemas.openxmlformats.org/drawingml/2006/picture">
+                <pic:pic>
+                  <pic:nvPicPr>
+                    <pic:cNvPr id="0" name="kfold_cv_boxplot.png"/>
+                    <pic:cNvPicPr/>
+                  </pic:nvPicPr>
+                  <pic:blipFill>
+                    <a:blip r:embed="rId5"/>
+                    <a:stretch>
+                      <a:fillRect/>
+                    </a:stretch>
+                  </pic:blipFill>
+                  <pic:spPr>
+                    <a:xfrm>
+                      <a:off x="0" y="0"/>
+                      <a:ext cx="4114800" cy="1021463"/>
+                    </a:xfrm>
+                    <a:prstGeom prst="rect"/>
+                  </pic:spPr>
+                </pic:pic>
+              </a:graphicData>
+            </a:graphic>
+          </wp:inline>
+        </w:drawing>
+      </w:r>
+    </w:p>
+    <w:p>
+      <w:r>
+        <w:rPr>
+          <w:i/>
+          <w:sz w:val="18"/>
+          <w:szCs w:val="18"/>
+        </w:rPr>
+        <w:t xml:space="preserve">Şekil 10: 5-Fold CV metrik dağılımları (Box Plot). Dört temel metrik için EfficientNet ve Swin Transformer'ın kutu grafiği ile karşılaştırılması. Sarı elmas ortalama, turuncu çizgi medyan değeri temsil etmektedir.</w:t>
+      </w:r>
+    </w:p>
+    <w:p>
+      <w:r>
+        <w:rPr>
+          <w:sz w:val="20"/>
+          <w:szCs w:val="20"/>
+        </w:rPr>
+        <w:t xml:space="preserve">Şekil 9 ve 10'daki görselleştirmeler birlikte değerlendirildiğinde şu çıkarımlar elde edilmektedir: (1) Her iki model de tüm fold'larda %97,5'in üzerinde tutarlı performans göstermektedir. (2) Swin Transformer ortalama olarak küçük bir üstünlük sağlamakla birlikte daha geniş bir dağılıma sahiptir. (3) EfficientNetV2-S daha düşük standart sapma ile daha kararlı sonuçlar üretmektedir. (4) Kutu grafiklerinde aykırı değer bulunmaması, her iki modelin de herhangi bir fold'da ciddi performans düşüşü yaşamadığını göstermektedir. Bu sonuçlar, Bölüm 5.2'de tek fold üzerinden raporlanan performansların istatistiksel olarak güvenilir olduğunu teyit etmektedir.</w:t>
+      </w:r>
+    </w:p>
+    <w:p>
+      <w:r>
+        <w:rPr>
+          <w:sz w:val="20"/>
+          <w:szCs w:val="20"/>
+        </w:rPr>
+        <w:t xml:space="preserve"/>
+      </w:r>
+    </w:p>
     <w:p xmlns:wp14="http://schemas.microsoft.com/office/word/2010/wordml" wp14:textId="77777777">
       <w:pPr>
         <w:pStyle w:val="Heading1"/>

</xml_diff>

<commit_message>
Restore IEEE format: rebuild PDF from original LaTeX source with correct section ordering, fix DOCX heading colors to black
Co-authored-by: emirsecer1 <158167678+emirsecer1@users.noreply.github.com>
Agent-Logs-Url: https://github.com/emirsecer1/BeeDiseasesClassification/sessions/b91d7ea8-1f61-43d6-98b3-2409a3e633db
</commit_message>
<xml_diff>
--- a/Results/BeeDiesessClassificion.docx
+++ b/Results/BeeDiesessClassificion.docx
@@ -28227,7 +28227,7 @@
     <w:next w:val="Normal"/>
     <w:qFormat/>
     <w:rPr>
-      <w:color w:val="2E74B5"/>
+      <w:color w:val="000000"/>
       <w:sz w:val="32"/>
       <w:szCs w:val="32"/>
     </w:rPr>
@@ -28238,7 +28238,7 @@
     <w:next w:val="Normal"/>
     <w:qFormat/>
     <w:rPr>
-      <w:color w:val="2E74B5"/>
+      <w:color w:val="000000"/>
       <w:sz w:val="26"/>
       <w:szCs w:val="26"/>
     </w:rPr>
@@ -28249,7 +28249,7 @@
     <w:next w:val="Normal"/>
     <w:qFormat/>
     <w:rPr>
-      <w:color w:val="1F4D78"/>
+      <w:color w:val="000000"/>
       <w:sz w:val="24"/>
       <w:szCs w:val="24"/>
     </w:rPr>
@@ -28262,7 +28262,7 @@
     <w:rPr>
       <w:i/>
       <w:iCs/>
-      <w:color w:val="2E74B5"/>
+      <w:color w:val="000000"/>
     </w:rPr>
   </w:style>
   <w:style w:type="paragraph" w:styleId="Heading5">
@@ -28271,7 +28271,7 @@
     <w:next w:val="Normal"/>
     <w:qFormat/>
     <w:rPr>
-      <w:color w:val="2E74B5"/>
+      <w:color w:val="000000"/>
     </w:rPr>
   </w:style>
   <w:style w:type="paragraph" w:styleId="Heading6">
@@ -28280,7 +28280,7 @@
     <w:next w:val="Normal"/>
     <w:qFormat/>
     <w:rPr>
-      <w:color w:val="1F4D78"/>
+      <w:color w:val="000000"/>
     </w:rPr>
   </w:style>
   <w:style w:type="paragraph" w:styleId="Strong">

</xml_diff>